<commit_message>
add init login and send otp
</commit_message>
<xml_diff>
--- a/Docs Project/Login logic.docx
+++ b/Docs Project/Login logic.docx
@@ -25,8 +25,8 @@
         <w:tblLook w:val="04A0" w:firstRow="1" w:lastRow="0" w:firstColumn="1" w:lastColumn="0" w:noHBand="0" w:noVBand="1"/>
       </w:tblPr>
       <w:tblGrid>
-        <w:gridCol w:w="2056"/>
-        <w:gridCol w:w="7284"/>
+        <w:gridCol w:w="1141"/>
+        <w:gridCol w:w="8199"/>
       </w:tblGrid>
       <w:tr>
         <w:trPr>
@@ -85,9 +85,11 @@
             <w:hideMark/>
           </w:tcPr>
           <w:p>
+            <w:proofErr w:type="spellStart"/>
             <w:r>
               <w:t>SanaadHealth</w:t>
             </w:r>
+            <w:proofErr w:type="spellEnd"/>
           </w:p>
         </w:tc>
         <w:tc>
@@ -110,8 +112,15 @@
           </w:tcPr>
           <w:p>
             <w:r>
-              <w:t>/healthcheck</w:t>
-            </w:r>
+              <w:t>/</w:t>
+            </w:r>
+            <w:proofErr w:type="spellStart"/>
+            <w:proofErr w:type="gramStart"/>
+            <w:r>
+              <w:t>healthcheck</w:t>
+            </w:r>
+            <w:proofErr w:type="spellEnd"/>
+            <w:proofErr w:type="gramEnd"/>
           </w:p>
           <w:p>
             <w:r>
@@ -125,18 +134,149 @@
           </w:p>
           <w:p>
             <w:r>
-              <w:t>SELECT SchDownStartTime, SchDownEndTime, A.Description, C.ReasonDesc FROM HMC_Sanad_AppDownTime_tbl A</w:t>
-            </w:r>
-          </w:p>
-          <w:p>
-            <w:r>
-              <w:t>LEFT OUTER JOIN HMC_Sanad_AppMaster_Tbl B ON B.ID = A.APPID LEFT OUTER JOIN HMC_Sanad_DTReason_Mast_tbl C ON C.ReasonCode = A.ReasonCode</w:t>
-            </w:r>
-          </w:p>
-          <w:p>
-            <w:r>
-              <w:t>WHERE  B.AppName = &lt;AppName&gt; AND GETDATE() BETWEEN A.SchDownStartTime AND A.SchDownEndTime</w:t>
-            </w:r>
+              <w:t xml:space="preserve">SELECT </w:t>
+            </w:r>
+            <w:proofErr w:type="spellStart"/>
+            <w:r>
+              <w:t>SchDownStartTime</w:t>
+            </w:r>
+            <w:proofErr w:type="spellEnd"/>
+            <w:r>
+              <w:t xml:space="preserve">, </w:t>
+            </w:r>
+            <w:proofErr w:type="spellStart"/>
+            <w:r>
+              <w:t>SchDownEndTime</w:t>
+            </w:r>
+            <w:proofErr w:type="spellEnd"/>
+            <w:r>
+              <w:t xml:space="preserve">, </w:t>
+            </w:r>
+            <w:proofErr w:type="spellStart"/>
+            <w:proofErr w:type="gramStart"/>
+            <w:r>
+              <w:t>A.Description</w:t>
+            </w:r>
+            <w:proofErr w:type="spellEnd"/>
+            <w:proofErr w:type="gramEnd"/>
+            <w:r>
+              <w:t xml:space="preserve">, </w:t>
+            </w:r>
+            <w:proofErr w:type="spellStart"/>
+            <w:proofErr w:type="gramStart"/>
+            <w:r>
+              <w:t>C.ReasonDesc</w:t>
+            </w:r>
+            <w:proofErr w:type="spellEnd"/>
+            <w:proofErr w:type="gramEnd"/>
+            <w:r>
+              <w:t xml:space="preserve"> FROM </w:t>
+            </w:r>
+            <w:proofErr w:type="spellStart"/>
+            <w:r>
+              <w:t>HMC_Sanad_AppDownTime_tbl</w:t>
+            </w:r>
+            <w:proofErr w:type="spellEnd"/>
+            <w:r>
+              <w:t xml:space="preserve"> A</w:t>
+            </w:r>
+          </w:p>
+          <w:p>
+            <w:r>
+              <w:t xml:space="preserve">LEFT OUTER JOIN </w:t>
+            </w:r>
+            <w:proofErr w:type="spellStart"/>
+            <w:r>
+              <w:t>HMC_Sanad_AppMaster_Tbl</w:t>
+            </w:r>
+            <w:proofErr w:type="spellEnd"/>
+            <w:r>
+              <w:t xml:space="preserve"> B ON B.ID = </w:t>
+            </w:r>
+            <w:proofErr w:type="gramStart"/>
+            <w:r>
+              <w:t>A.APPID</w:t>
+            </w:r>
+            <w:proofErr w:type="gramEnd"/>
+            <w:r>
+              <w:t xml:space="preserve"> LEFT OUTER JOIN </w:t>
+            </w:r>
+            <w:proofErr w:type="spellStart"/>
+            <w:r>
+              <w:t>HMC_Sanad_DTReason_Mast_tbl</w:t>
+            </w:r>
+            <w:proofErr w:type="spellEnd"/>
+            <w:r>
+              <w:t xml:space="preserve"> C ON </w:t>
+            </w:r>
+            <w:proofErr w:type="spellStart"/>
+            <w:proofErr w:type="gramStart"/>
+            <w:r>
+              <w:t>C.ReasonCode</w:t>
+            </w:r>
+            <w:proofErr w:type="spellEnd"/>
+            <w:proofErr w:type="gramEnd"/>
+            <w:r>
+              <w:t xml:space="preserve"> = </w:t>
+            </w:r>
+            <w:proofErr w:type="spellStart"/>
+            <w:proofErr w:type="gramStart"/>
+            <w:r>
+              <w:t>A.ReasonCode</w:t>
+            </w:r>
+            <w:proofErr w:type="spellEnd"/>
+            <w:proofErr w:type="gramEnd"/>
+          </w:p>
+          <w:p>
+            <w:proofErr w:type="gramStart"/>
+            <w:r>
+              <w:t xml:space="preserve">WHERE  </w:t>
+            </w:r>
+            <w:proofErr w:type="spellStart"/>
+            <w:r>
+              <w:t>B</w:t>
+            </w:r>
+            <w:proofErr w:type="gramEnd"/>
+            <w:r>
+              <w:t>.AppName</w:t>
+            </w:r>
+            <w:proofErr w:type="spellEnd"/>
+            <w:r>
+              <w:t xml:space="preserve"> = &lt;</w:t>
+            </w:r>
+            <w:proofErr w:type="spellStart"/>
+            <w:r>
+              <w:t>AppName</w:t>
+            </w:r>
+            <w:proofErr w:type="spellEnd"/>
+            <w:r>
+              <w:t xml:space="preserve">&gt; AND </w:t>
+            </w:r>
+            <w:proofErr w:type="gramStart"/>
+            <w:r>
+              <w:t>GETDATE(</w:t>
+            </w:r>
+            <w:proofErr w:type="gramEnd"/>
+            <w:r>
+              <w:t xml:space="preserve">) BETWEEN </w:t>
+            </w:r>
+            <w:proofErr w:type="spellStart"/>
+            <w:proofErr w:type="gramStart"/>
+            <w:r>
+              <w:t>A.SchDownStartTime</w:t>
+            </w:r>
+            <w:proofErr w:type="spellEnd"/>
+            <w:proofErr w:type="gramEnd"/>
+            <w:r>
+              <w:t xml:space="preserve"> AND </w:t>
+            </w:r>
+            <w:proofErr w:type="spellStart"/>
+            <w:proofErr w:type="gramStart"/>
+            <w:r>
+              <w:t>A.SchDownEndTime</w:t>
+            </w:r>
+            <w:proofErr w:type="spellEnd"/>
+            <w:proofErr w:type="gramEnd"/>
           </w:p>
           <w:p>
             <w:r>
@@ -145,12 +285,144 @@
           </w:p>
           <w:p>
             <w:r>
-              <w:t>SELECT A.NotifyUsers, A.UpdateType FROM HMC_Sanad_App_Update_tbl A LEFT OUTER JOIN HMC_Sanad_AppMaster_Tbl B ON B.ID = A.APPID LEFT OUTER JOIN HMC_Sanad_AppVersion_Control_tbl C ON C.APPID = A.APPID AND A.FromVersionID = C.ID  WHERE B.AppName = &lt;AppName&gt; AND C.Version = &lt;AppVersion&gt;</w:t>
-            </w:r>
-          </w:p>
-          <w:p>
-            <w:r>
-              <w:t>AND A.Status = 1</w:t>
+              <w:t xml:space="preserve">SELECT </w:t>
+            </w:r>
+            <w:proofErr w:type="spellStart"/>
+            <w:proofErr w:type="gramStart"/>
+            <w:r>
+              <w:t>A.NotifyUsers</w:t>
+            </w:r>
+            <w:proofErr w:type="spellEnd"/>
+            <w:proofErr w:type="gramEnd"/>
+            <w:r>
+              <w:t xml:space="preserve">, </w:t>
+            </w:r>
+            <w:proofErr w:type="spellStart"/>
+            <w:proofErr w:type="gramStart"/>
+            <w:r>
+              <w:t>A.UpdateType</w:t>
+            </w:r>
+            <w:proofErr w:type="spellEnd"/>
+            <w:proofErr w:type="gramEnd"/>
+            <w:r>
+              <w:t xml:space="preserve"> FROM </w:t>
+            </w:r>
+            <w:proofErr w:type="spellStart"/>
+            <w:r>
+              <w:t>HMC_Sanad_App_Update_tbl</w:t>
+            </w:r>
+            <w:proofErr w:type="spellEnd"/>
+            <w:r>
+              <w:t xml:space="preserve"> A LEFT OUTER JOIN </w:t>
+            </w:r>
+            <w:proofErr w:type="spellStart"/>
+            <w:r>
+              <w:t>HMC_Sanad_AppMaster_Tbl</w:t>
+            </w:r>
+            <w:proofErr w:type="spellEnd"/>
+            <w:r>
+              <w:t xml:space="preserve"> B ON B.ID = </w:t>
+            </w:r>
+            <w:proofErr w:type="gramStart"/>
+            <w:r>
+              <w:t>A.APPID</w:t>
+            </w:r>
+            <w:proofErr w:type="gramEnd"/>
+            <w:r>
+              <w:t xml:space="preserve"> LEFT OUTER JOIN </w:t>
+            </w:r>
+            <w:proofErr w:type="spellStart"/>
+            <w:r>
+              <w:t>HMC_Sanad_AppVersion_Control_tbl</w:t>
+            </w:r>
+            <w:proofErr w:type="spellEnd"/>
+            <w:r>
+              <w:t xml:space="preserve"> C ON </w:t>
+            </w:r>
+            <w:proofErr w:type="gramStart"/>
+            <w:r>
+              <w:t>C.APPID</w:t>
+            </w:r>
+            <w:proofErr w:type="gramEnd"/>
+            <w:r>
+              <w:t xml:space="preserve"> = </w:t>
+            </w:r>
+            <w:proofErr w:type="gramStart"/>
+            <w:r>
+              <w:t>A.APPID</w:t>
+            </w:r>
+            <w:proofErr w:type="gramEnd"/>
+            <w:r>
+              <w:t xml:space="preserve"> AND </w:t>
+            </w:r>
+            <w:proofErr w:type="spellStart"/>
+            <w:proofErr w:type="gramStart"/>
+            <w:r>
+              <w:t>A.FromVersionID</w:t>
+            </w:r>
+            <w:proofErr w:type="spellEnd"/>
+            <w:proofErr w:type="gramEnd"/>
+            <w:r>
+              <w:t xml:space="preserve"> = C.</w:t>
+            </w:r>
+            <w:proofErr w:type="gramStart"/>
+            <w:r>
+              <w:t>ID  WHERE</w:t>
+            </w:r>
+            <w:proofErr w:type="gramEnd"/>
+            <w:r>
+              <w:t xml:space="preserve"> </w:t>
+            </w:r>
+            <w:proofErr w:type="spellStart"/>
+            <w:proofErr w:type="gramStart"/>
+            <w:r>
+              <w:t>B.AppName</w:t>
+            </w:r>
+            <w:proofErr w:type="spellEnd"/>
+            <w:proofErr w:type="gramEnd"/>
+            <w:r>
+              <w:t xml:space="preserve"> = &lt;</w:t>
+            </w:r>
+            <w:proofErr w:type="spellStart"/>
+            <w:r>
+              <w:t>AppName</w:t>
+            </w:r>
+            <w:proofErr w:type="spellEnd"/>
+            <w:r>
+              <w:t xml:space="preserve">&gt; AND </w:t>
+            </w:r>
+            <w:proofErr w:type="spellStart"/>
+            <w:proofErr w:type="gramStart"/>
+            <w:r>
+              <w:t>C.Version</w:t>
+            </w:r>
+            <w:proofErr w:type="spellEnd"/>
+            <w:proofErr w:type="gramEnd"/>
+            <w:r>
+              <w:t xml:space="preserve"> = &lt;</w:t>
+            </w:r>
+            <w:proofErr w:type="spellStart"/>
+            <w:r>
+              <w:t>AppVersion</w:t>
+            </w:r>
+            <w:proofErr w:type="spellEnd"/>
+            <w:r>
+              <w:t>&gt;</w:t>
+            </w:r>
+          </w:p>
+          <w:p>
+            <w:r>
+              <w:t xml:space="preserve">AND </w:t>
+            </w:r>
+            <w:proofErr w:type="spellStart"/>
+            <w:proofErr w:type="gramStart"/>
+            <w:r>
+              <w:t>A.Status</w:t>
+            </w:r>
+            <w:proofErr w:type="spellEnd"/>
+            <w:proofErr w:type="gramEnd"/>
+            <w:r>
+              <w:t xml:space="preserve"> = 1</w:t>
             </w:r>
           </w:p>
         </w:tc>
@@ -178,9 +450,11 @@
             <w:hideMark/>
           </w:tcPr>
           <w:p>
+            <w:proofErr w:type="spellStart"/>
             <w:r>
               <w:t>userValidate</w:t>
             </w:r>
+            <w:proofErr w:type="spellEnd"/>
           </w:p>
         </w:tc>
         <w:tc>
@@ -213,7 +487,55 @@
           </w:p>
           <w:p>
             <w:r>
-              <w:t>SELECT DeviceID FROM HMC_Sanad_DeviceRegn_tbl WHERE LoginID = &lt;LoginID&gt; AND IMEINumber = &lt;IMEINumber&gt;</w:t>
+              <w:t xml:space="preserve">SELECT </w:t>
+            </w:r>
+            <w:proofErr w:type="spellStart"/>
+            <w:r>
+              <w:t>DeviceID</w:t>
+            </w:r>
+            <w:proofErr w:type="spellEnd"/>
+            <w:r>
+              <w:t xml:space="preserve"> FROM </w:t>
+            </w:r>
+            <w:proofErr w:type="spellStart"/>
+            <w:r>
+              <w:t>HMC_Sanad_DeviceRegn_tbl</w:t>
+            </w:r>
+            <w:proofErr w:type="spellEnd"/>
+            <w:r>
+              <w:t xml:space="preserve"> WHERE </w:t>
+            </w:r>
+            <w:proofErr w:type="spellStart"/>
+            <w:r>
+              <w:t>LoginID</w:t>
+            </w:r>
+            <w:proofErr w:type="spellEnd"/>
+            <w:r>
+              <w:t xml:space="preserve"> = &lt;</w:t>
+            </w:r>
+            <w:proofErr w:type="spellStart"/>
+            <w:r>
+              <w:t>LoginID</w:t>
+            </w:r>
+            <w:proofErr w:type="spellEnd"/>
+            <w:r>
+              <w:t xml:space="preserve">&gt; AND </w:t>
+            </w:r>
+            <w:proofErr w:type="spellStart"/>
+            <w:r>
+              <w:t>IMEINumber</w:t>
+            </w:r>
+            <w:proofErr w:type="spellEnd"/>
+            <w:r>
+              <w:t xml:space="preserve"> = &lt;</w:t>
+            </w:r>
+            <w:proofErr w:type="spellStart"/>
+            <w:r>
+              <w:t>IMEINumber</w:t>
+            </w:r>
+            <w:proofErr w:type="spellEnd"/>
+            <w:r>
+              <w:t>&gt;</w:t>
             </w:r>
           </w:p>
         </w:tc>
@@ -241,9 +563,11 @@
             <w:hideMark/>
           </w:tcPr>
           <w:p>
+            <w:proofErr w:type="spellStart"/>
             <w:r>
               <w:t>OTPValidate</w:t>
             </w:r>
+            <w:proofErr w:type="spellEnd"/>
           </w:p>
         </w:tc>
         <w:tc>
@@ -266,7 +590,15 @@
           </w:tcPr>
           <w:p>
             <w:r>
-              <w:t>/auth/otp/validate</w:t>
+              <w:t>/auth/</w:t>
+            </w:r>
+            <w:proofErr w:type="spellStart"/>
+            <w:r>
+              <w:t>otp</w:t>
+            </w:r>
+            <w:proofErr w:type="spellEnd"/>
+            <w:r>
+              <w:t>/validate</w:t>
             </w:r>
           </w:p>
           <w:p>
@@ -276,11 +608,95 @@
           </w:p>
           <w:p>
             <w:r>
-              <w:t xml:space="preserve">SELECT TOP 1 SeqNo,  DATEDIFF(SECOND, OTPSentDateTime, GETDATE()) AS DiffInSeconds, OTPValue  FROM  HMC_RHAP_OTP_tbl </w:t>
-            </w:r>
-            <w:r>
               <w:lastRenderedPageBreak/>
-              <w:t>WITH (NOLOCK) WHERE  LoginID = &lt;LoginID&gt; AND DeviceIMEINumber= &lt; DeviceIMEINumber&gt;</w:t>
+              <w:t xml:space="preserve">SELECT TOP 1 </w:t>
+            </w:r>
+            <w:proofErr w:type="spellStart"/>
+            <w:proofErr w:type="gramStart"/>
+            <w:r>
+              <w:t>SeqNo</w:t>
+            </w:r>
+            <w:proofErr w:type="spellEnd"/>
+            <w:r>
+              <w:t>,  DATEDIFF</w:t>
+            </w:r>
+            <w:proofErr w:type="gramEnd"/>
+            <w:r>
+              <w:t xml:space="preserve">(SECOND, OTPSentDateTime, </w:t>
+            </w:r>
+            <w:proofErr w:type="gramStart"/>
+            <w:r>
+              <w:t>GETDATE(</w:t>
+            </w:r>
+            <w:proofErr w:type="gramEnd"/>
+            <w:r>
+              <w:t xml:space="preserve">)) AS </w:t>
+            </w:r>
+            <w:proofErr w:type="spellStart"/>
+            <w:r>
+              <w:t>DiffInSeconds</w:t>
+            </w:r>
+            <w:proofErr w:type="spellEnd"/>
+            <w:r>
+              <w:t xml:space="preserve">, </w:t>
+            </w:r>
+            <w:proofErr w:type="spellStart"/>
+            <w:proofErr w:type="gramStart"/>
+            <w:r>
+              <w:t>OTPValue</w:t>
+            </w:r>
+            <w:proofErr w:type="spellEnd"/>
+            <w:r>
+              <w:t>  FROM</w:t>
+            </w:r>
+            <w:proofErr w:type="gramEnd"/>
+            <w:r>
+              <w:t xml:space="preserve">  </w:t>
+            </w:r>
+            <w:proofErr w:type="spellStart"/>
+            <w:r>
+              <w:t>HMC_RHAP_OTP_tbl</w:t>
+            </w:r>
+            <w:proofErr w:type="spellEnd"/>
+            <w:r>
+              <w:t xml:space="preserve"> WITH (NOLOCK) </w:t>
+            </w:r>
+            <w:proofErr w:type="gramStart"/>
+            <w:r>
+              <w:t>WHERE  </w:t>
+            </w:r>
+            <w:proofErr w:type="spellStart"/>
+            <w:r>
+              <w:t>LoginID</w:t>
+            </w:r>
+            <w:proofErr w:type="spellEnd"/>
+            <w:proofErr w:type="gramEnd"/>
+            <w:r>
+              <w:t xml:space="preserve"> = &lt;</w:t>
+            </w:r>
+            <w:proofErr w:type="spellStart"/>
+            <w:r>
+              <w:t>LoginID</w:t>
+            </w:r>
+            <w:proofErr w:type="spellEnd"/>
+            <w:r>
+              <w:t xml:space="preserve">&gt; AND </w:t>
+            </w:r>
+            <w:proofErr w:type="spellStart"/>
+            <w:r>
+              <w:t>DeviceIMEINumber</w:t>
+            </w:r>
+            <w:proofErr w:type="spellEnd"/>
+            <w:r>
+              <w:t>= &lt; </w:t>
+            </w:r>
+            <w:proofErr w:type="spellStart"/>
+            <w:r>
+              <w:t>DeviceIMEINumber</w:t>
+            </w:r>
+            <w:proofErr w:type="spellEnd"/>
+            <w:r>
+              <w:t>&gt;</w:t>
             </w:r>
           </w:p>
         </w:tc>
@@ -308,10 +724,12 @@
             <w:hideMark/>
           </w:tcPr>
           <w:p>
+            <w:proofErr w:type="spellStart"/>
             <w:r>
               <w:lastRenderedPageBreak/>
               <w:t>OTPResend</w:t>
             </w:r>
+            <w:proofErr w:type="spellEnd"/>
           </w:p>
         </w:tc>
         <w:tc>
@@ -334,7 +752,15 @@
           </w:tcPr>
           <w:p>
             <w:r>
-              <w:t>/auth/otp/resend</w:t>
+              <w:t>/auth/</w:t>
+            </w:r>
+            <w:proofErr w:type="spellStart"/>
+            <w:r>
+              <w:t>otp</w:t>
+            </w:r>
+            <w:proofErr w:type="spellEnd"/>
+            <w:r>
+              <w:t>/resend</w:t>
             </w:r>
           </w:p>
           <w:p>
@@ -344,7 +770,296 @@
           </w:p>
           <w:p>
             <w:r>
-              <w:t>SELECT TOP 1 SeqNo, DATEDIFF(SECOND, OTPSentDateTime, GETDATE()) AS DiffInSeconds, OTPValue FROM  HMC_RHAP_OTP_tbl  WHERE LoginID = &lt;LoginID&gt; AND DeviceIMEINumber= &lt; DeviceIMEINumber&gt;</w:t>
+              <w:t xml:space="preserve">SELECT TOP 1 </w:t>
+            </w:r>
+            <w:proofErr w:type="spellStart"/>
+            <w:r>
+              <w:t>SeqNo</w:t>
+            </w:r>
+            <w:proofErr w:type="spellEnd"/>
+            <w:r>
+              <w:t xml:space="preserve">, </w:t>
+            </w:r>
+            <w:proofErr w:type="gramStart"/>
+            <w:r>
+              <w:t>DATEDIFF(</w:t>
+            </w:r>
+            <w:proofErr w:type="gramEnd"/>
+            <w:r>
+              <w:t xml:space="preserve">SECOND, OTPSentDateTime, </w:t>
+            </w:r>
+            <w:proofErr w:type="gramStart"/>
+            <w:r>
+              <w:t>GETDATE(</w:t>
+            </w:r>
+            <w:proofErr w:type="gramEnd"/>
+            <w:r>
+              <w:t xml:space="preserve">)) AS </w:t>
+            </w:r>
+            <w:proofErr w:type="spellStart"/>
+            <w:r>
+              <w:t>DiffInSeconds</w:t>
+            </w:r>
+            <w:proofErr w:type="spellEnd"/>
+            <w:r>
+              <w:t xml:space="preserve">, </w:t>
+            </w:r>
+            <w:proofErr w:type="spellStart"/>
+            <w:r>
+              <w:t>OTPValue</w:t>
+            </w:r>
+            <w:proofErr w:type="spellEnd"/>
+            <w:r>
+              <w:t xml:space="preserve"> </w:t>
+            </w:r>
+            <w:proofErr w:type="gramStart"/>
+            <w:r>
+              <w:t>FROM  </w:t>
+            </w:r>
+            <w:proofErr w:type="spellStart"/>
+            <w:r>
+              <w:t>HMC</w:t>
+            </w:r>
+            <w:proofErr w:type="gramEnd"/>
+            <w:r>
+              <w:t>_RHAP_OTP_</w:t>
+            </w:r>
+            <w:proofErr w:type="gramStart"/>
+            <w:r>
+              <w:t>tbl</w:t>
+            </w:r>
+            <w:proofErr w:type="spellEnd"/>
+            <w:r>
+              <w:t xml:space="preserve">  WHERE</w:t>
+            </w:r>
+            <w:proofErr w:type="gramEnd"/>
+            <w:r>
+              <w:t xml:space="preserve"> </w:t>
+            </w:r>
+            <w:proofErr w:type="spellStart"/>
+            <w:r>
+              <w:t>LoginID</w:t>
+            </w:r>
+            <w:proofErr w:type="spellEnd"/>
+            <w:r>
+              <w:t xml:space="preserve"> = &lt;</w:t>
+            </w:r>
+            <w:proofErr w:type="spellStart"/>
+            <w:r>
+              <w:t>LoginID</w:t>
+            </w:r>
+            <w:proofErr w:type="spellEnd"/>
+            <w:r>
+              <w:t xml:space="preserve">&gt; AND </w:t>
+            </w:r>
+            <w:proofErr w:type="spellStart"/>
+            <w:r>
+              <w:t>DeviceIMEINumber</w:t>
+            </w:r>
+            <w:proofErr w:type="spellEnd"/>
+            <w:r>
+              <w:t>= &lt; </w:t>
+            </w:r>
+            <w:proofErr w:type="spellStart"/>
+            <w:r>
+              <w:t>DeviceIMEINumber</w:t>
+            </w:r>
+            <w:proofErr w:type="spellEnd"/>
+            <w:r>
+              <w:t>&gt;</w:t>
+            </w:r>
+          </w:p>
+          <w:p/>
+          <w:p>
+            <w:r>
+              <w:br/>
+            </w:r>
+            <w:r>
+              <w:t>INSERT INTO </w:t>
+            </w:r>
+            <w:proofErr w:type="spellStart"/>
+            <w:r>
+              <w:t>MOTC_SMS_PushTable</w:t>
+            </w:r>
+            <w:proofErr w:type="spellEnd"/>
+            <w:r>
+              <w:t xml:space="preserve"> (</w:t>
+            </w:r>
+            <w:proofErr w:type="spellStart"/>
+            <w:r>
+              <w:t>MessageID</w:t>
+            </w:r>
+            <w:proofErr w:type="spellEnd"/>
+            <w:r>
+              <w:t xml:space="preserve">, </w:t>
+            </w:r>
+            <w:proofErr w:type="spellStart"/>
+            <w:r>
+              <w:t>ToAddress</w:t>
+            </w:r>
+            <w:proofErr w:type="spellEnd"/>
+            <w:r>
+              <w:t xml:space="preserve">, </w:t>
+            </w:r>
+            <w:proofErr w:type="spellStart"/>
+            <w:r>
+              <w:t>MessageBody</w:t>
+            </w:r>
+            <w:proofErr w:type="spellEnd"/>
+            <w:r>
+              <w:t xml:space="preserve">, </w:t>
+            </w:r>
+            <w:proofErr w:type="spellStart"/>
+            <w:r>
+              <w:t>AddedTimeStamp</w:t>
+            </w:r>
+            <w:proofErr w:type="spellEnd"/>
+            <w:r>
+              <w:t xml:space="preserve">, </w:t>
+            </w:r>
+            <w:proofErr w:type="spellStart"/>
+            <w:r>
+              <w:t>ProcessedState</w:t>
+            </w:r>
+            <w:proofErr w:type="spellEnd"/>
+            <w:r>
+              <w:t xml:space="preserve">, </w:t>
+            </w:r>
+            <w:proofErr w:type="spellStart"/>
+            <w:r>
+              <w:t>ProcessedTimeStamp</w:t>
+            </w:r>
+            <w:proofErr w:type="spellEnd"/>
+            <w:r>
+              <w:t xml:space="preserve">, Priority, </w:t>
+            </w:r>
+            <w:proofErr w:type="spellStart"/>
+            <w:r>
+              <w:t>ServiceID</w:t>
+            </w:r>
+            <w:proofErr w:type="spellEnd"/>
+            <w:r>
+              <w:t xml:space="preserve">, </w:t>
+            </w:r>
+            <w:proofErr w:type="spellStart"/>
+            <w:r>
+              <w:t>SubjectID</w:t>
+            </w:r>
+            <w:proofErr w:type="spellEnd"/>
+            <w:r>
+              <w:t xml:space="preserve">, LANGUAGE_ID, </w:t>
+            </w:r>
+            <w:proofErr w:type="spellStart"/>
+            <w:r>
+              <w:t>RecipientAddressType</w:t>
+            </w:r>
+            <w:proofErr w:type="spellEnd"/>
+            <w:r>
+              <w:t xml:space="preserve">, </w:t>
+            </w:r>
+            <w:proofErr w:type="spellStart"/>
+            <w:r>
+              <w:t>MessageSendScheduleDateTime</w:t>
+            </w:r>
+            <w:proofErr w:type="spellEnd"/>
+            <w:r>
+              <w:t xml:space="preserve">, </w:t>
+            </w:r>
+            <w:proofErr w:type="spellStart"/>
+            <w:r>
+              <w:t>MessageExpireMinutes</w:t>
+            </w:r>
+            <w:proofErr w:type="spellEnd"/>
+            <w:r>
+              <w:t xml:space="preserve">, </w:t>
+            </w:r>
+            <w:proofErr w:type="spellStart"/>
+            <w:r>
+              <w:t>CustomerID</w:t>
+            </w:r>
+            <w:proofErr w:type="spellEnd"/>
+            <w:r>
+              <w:t xml:space="preserve">, </w:t>
+            </w:r>
+            <w:proofErr w:type="spellStart"/>
+            <w:r>
+              <w:t>FromAddress</w:t>
+            </w:r>
+            <w:proofErr w:type="spellEnd"/>
+            <w:r>
+              <w:t xml:space="preserve">, </w:t>
+            </w:r>
+            <w:proofErr w:type="spellStart"/>
+            <w:r>
+              <w:t>MaskMessageLog</w:t>
+            </w:r>
+            <w:proofErr w:type="spellEnd"/>
+            <w:r>
+              <w:t xml:space="preserve">, </w:t>
+            </w:r>
+            <w:proofErr w:type="spellStart"/>
+            <w:r>
+              <w:t>ApplicationID</w:t>
+            </w:r>
+            <w:proofErr w:type="spellEnd"/>
+            <w:r>
+              <w:t>, BusinessParam1, BusinessParam2)  VALUES (&lt;Id&gt;,&lt;MobileNumber&gt;,&lt;Message&gt;,&lt;CurrentDatetime&gt;,&lt;ProcessedState&gt;,&lt;ProcessedTimeStamp&gt;,&lt;Priority&gt;,&lt;AppId&gt;,&lt;Subject&gt;,&lt;LANGUAGE_ID&gt;, &lt;</w:t>
+            </w:r>
+            <w:proofErr w:type="spellStart"/>
+            <w:r>
+              <w:t>RecipientAddressType</w:t>
+            </w:r>
+            <w:proofErr w:type="spellEnd"/>
+            <w:r>
+              <w:t>&gt;, &lt;</w:t>
+            </w:r>
+            <w:proofErr w:type="spellStart"/>
+            <w:r>
+              <w:t>MessageSendScheduleDateTime</w:t>
+            </w:r>
+            <w:proofErr w:type="spellEnd"/>
+            <w:r>
+              <w:t>&gt;, &lt;</w:t>
+            </w:r>
+            <w:proofErr w:type="spellStart"/>
+            <w:r>
+              <w:t>MessageExpireMinutes</w:t>
+            </w:r>
+            <w:proofErr w:type="spellEnd"/>
+            <w:r>
+              <w:t>&gt;, &lt;</w:t>
+            </w:r>
+            <w:proofErr w:type="spellStart"/>
+            <w:r>
+              <w:t>CustomerID</w:t>
+            </w:r>
+            <w:proofErr w:type="spellEnd"/>
+            <w:r>
+              <w:t>&gt;, &lt;</w:t>
+            </w:r>
+            <w:proofErr w:type="spellStart"/>
+            <w:r>
+              <w:t>AppId</w:t>
+            </w:r>
+            <w:proofErr w:type="spellEnd"/>
+            <w:r>
+              <w:t>&gt;, &lt;</w:t>
+            </w:r>
+            <w:proofErr w:type="spellStart"/>
+            <w:r>
+              <w:t>MaskMessageLog</w:t>
+            </w:r>
+            <w:proofErr w:type="spellEnd"/>
+            <w:r>
+              <w:t>&gt;, &lt;</w:t>
+            </w:r>
+            <w:proofErr w:type="spellStart"/>
+            <w:r>
+              <w:t>AppId</w:t>
+            </w:r>
+            <w:proofErr w:type="spellEnd"/>
+            <w:r>
+              <w:t>&gt;, &lt;BusinessParam1&gt;, &lt;BusinessParam2&gt;)</w:t>
             </w:r>
           </w:p>
         </w:tc>
@@ -372,9 +1087,11 @@
             <w:hideMark/>
           </w:tcPr>
           <w:p>
+            <w:proofErr w:type="spellStart"/>
             <w:r>
               <w:t>UpdateMPIN</w:t>
             </w:r>
+            <w:proofErr w:type="spellEnd"/>
           </w:p>
         </w:tc>
         <w:tc>
@@ -397,7 +1114,15 @@
           </w:tcPr>
           <w:p>
             <w:r>
-              <w:t>/auth/mpin/update</w:t>
+              <w:t>/auth/</w:t>
+            </w:r>
+            <w:proofErr w:type="spellStart"/>
+            <w:r>
+              <w:t>mpin</w:t>
+            </w:r>
+            <w:proofErr w:type="spellEnd"/>
+            <w:r>
+              <w:t>/update</w:t>
             </w:r>
           </w:p>
           <w:p>
@@ -406,8 +1131,74 @@
             </w:r>
           </w:p>
           <w:p>
-            <w:r>
-              <w:t>UPDATE  HMC_Sanad_DeviceRegn_tbl SET DateFirstRegistered = GETDATE(),  MPIN = &lt;MPIN&gt; WHERE  LoginID = &lt;EmployeeUserName&gt; AND IMEINumber = &lt;EmployeeDeviceIMEINumber&gt;</w:t>
+            <w:proofErr w:type="gramStart"/>
+            <w:r>
+              <w:t>UPDATE  </w:t>
+            </w:r>
+            <w:proofErr w:type="spellStart"/>
+            <w:r>
+              <w:t>HMC</w:t>
+            </w:r>
+            <w:proofErr w:type="gramEnd"/>
+            <w:r>
+              <w:t>_Sanad_DeviceRegn_tbl</w:t>
+            </w:r>
+            <w:proofErr w:type="spellEnd"/>
+            <w:r>
+              <w:t xml:space="preserve"> SET </w:t>
+            </w:r>
+            <w:proofErr w:type="spellStart"/>
+            <w:r>
+              <w:t>DateFirstRegistered</w:t>
+            </w:r>
+            <w:proofErr w:type="spellEnd"/>
+            <w:r>
+              <w:t xml:space="preserve"> = </w:t>
+            </w:r>
+            <w:proofErr w:type="gramStart"/>
+            <w:r>
+              <w:t>GETDATE(),  MPIN</w:t>
+            </w:r>
+            <w:proofErr w:type="gramEnd"/>
+            <w:r>
+              <w:t xml:space="preserve"> = &lt;MPIN&gt; </w:t>
+            </w:r>
+            <w:proofErr w:type="gramStart"/>
+            <w:r>
+              <w:t>WHERE  </w:t>
+            </w:r>
+            <w:proofErr w:type="spellStart"/>
+            <w:r>
+              <w:t>LoginID</w:t>
+            </w:r>
+            <w:proofErr w:type="spellEnd"/>
+            <w:proofErr w:type="gramEnd"/>
+            <w:r>
+              <w:t xml:space="preserve"> = &lt;</w:t>
+            </w:r>
+            <w:proofErr w:type="spellStart"/>
+            <w:r>
+              <w:t>EmployeeUserName</w:t>
+            </w:r>
+            <w:proofErr w:type="spellEnd"/>
+            <w:r>
+              <w:t xml:space="preserve">&gt; AND </w:t>
+            </w:r>
+            <w:proofErr w:type="spellStart"/>
+            <w:r>
+              <w:t>IMEINumber</w:t>
+            </w:r>
+            <w:proofErr w:type="spellEnd"/>
+            <w:r>
+              <w:t xml:space="preserve"> = &lt;</w:t>
+            </w:r>
+            <w:proofErr w:type="spellStart"/>
+            <w:r>
+              <w:t>EmployeeDeviceIMEINumber</w:t>
+            </w:r>
+            <w:proofErr w:type="spellEnd"/>
+            <w:r>
+              <w:t>&gt;</w:t>
             </w:r>
           </w:p>
         </w:tc>
@@ -435,9 +1226,11 @@
             <w:hideMark/>
           </w:tcPr>
           <w:p>
+            <w:proofErr w:type="spellStart"/>
             <w:r>
               <w:t>LoginMPIN</w:t>
             </w:r>
+            <w:proofErr w:type="spellEnd"/>
           </w:p>
         </w:tc>
         <w:tc>
@@ -470,17 +1263,148 @@
           </w:p>
           <w:p>
             <w:r>
-              <w:t>SELECT DeviceID FROM  HMC_Sanad_DeviceRegn_tbl  WHERE IMEINumber = &lt;EmployeeDeviceIMEINumber&gt; AND LoginID = &lt;EmployeeUserName&gt; AND MPIN = &lt;MPIN&gt;</w:t>
-            </w:r>
-          </w:p>
-          <w:p>
-            <w:r>
+              <w:t xml:space="preserve">SELECT </w:t>
+            </w:r>
+            <w:proofErr w:type="spellStart"/>
+            <w:r>
+              <w:t>DeviceID</w:t>
+            </w:r>
+            <w:proofErr w:type="spellEnd"/>
+            <w:r>
+              <w:t xml:space="preserve"> </w:t>
+            </w:r>
+            <w:proofErr w:type="gramStart"/>
+            <w:r>
+              <w:t>FROM  </w:t>
+            </w:r>
+            <w:proofErr w:type="spellStart"/>
+            <w:r>
+              <w:t>HMC</w:t>
+            </w:r>
+            <w:proofErr w:type="gramEnd"/>
+            <w:r>
+              <w:t>_Sanad_DeviceRegn_</w:t>
+            </w:r>
+            <w:proofErr w:type="gramStart"/>
+            <w:r>
+              <w:t>tbl</w:t>
+            </w:r>
+            <w:proofErr w:type="spellEnd"/>
+            <w:r>
+              <w:t xml:space="preserve">  WHERE</w:t>
+            </w:r>
+            <w:proofErr w:type="gramEnd"/>
+            <w:r>
+              <w:t xml:space="preserve"> </w:t>
+            </w:r>
+            <w:proofErr w:type="spellStart"/>
+            <w:r>
+              <w:t>IMEINumber</w:t>
+            </w:r>
+            <w:proofErr w:type="spellEnd"/>
+            <w:r>
+              <w:t xml:space="preserve"> = &lt;</w:t>
+            </w:r>
+            <w:proofErr w:type="spellStart"/>
+            <w:r>
+              <w:t>EmployeeDeviceIMEINumber</w:t>
+            </w:r>
+            <w:proofErr w:type="spellEnd"/>
+            <w:r>
+              <w:t xml:space="preserve">&gt; AND </w:t>
+            </w:r>
+            <w:proofErr w:type="spellStart"/>
+            <w:r>
+              <w:t>LoginID</w:t>
+            </w:r>
+            <w:proofErr w:type="spellEnd"/>
+            <w:r>
+              <w:t xml:space="preserve"> = &lt;</w:t>
+            </w:r>
+            <w:proofErr w:type="spellStart"/>
+            <w:r>
+              <w:t>EmployeeUserName</w:t>
+            </w:r>
+            <w:proofErr w:type="spellEnd"/>
+            <w:r>
+              <w:t>&gt; AND MPIN = &lt;MPIN&gt;</w:t>
+            </w:r>
+          </w:p>
+          <w:p>
+            <w:r>
+              <w:lastRenderedPageBreak/>
               <w:t> </w:t>
             </w:r>
           </w:p>
           <w:p>
             <w:r>
-              <w:t>SELECT A.FunctionName, A.FunctionCode, A.Description, A.StatusCode  FROM  HMC_Sanad_AppMaster_VW A WHERE A.AppID = 1</w:t>
+              <w:t xml:space="preserve">SELECT </w:t>
+            </w:r>
+            <w:proofErr w:type="spellStart"/>
+            <w:proofErr w:type="gramStart"/>
+            <w:r>
+              <w:t>A.FunctionName</w:t>
+            </w:r>
+            <w:proofErr w:type="spellEnd"/>
+            <w:proofErr w:type="gramEnd"/>
+            <w:r>
+              <w:t xml:space="preserve">, </w:t>
+            </w:r>
+            <w:proofErr w:type="spellStart"/>
+            <w:proofErr w:type="gramStart"/>
+            <w:r>
+              <w:t>A.FunctionCode</w:t>
+            </w:r>
+            <w:proofErr w:type="spellEnd"/>
+            <w:proofErr w:type="gramEnd"/>
+            <w:r>
+              <w:t xml:space="preserve">, </w:t>
+            </w:r>
+            <w:proofErr w:type="spellStart"/>
+            <w:proofErr w:type="gramStart"/>
+            <w:r>
+              <w:t>A.Description</w:t>
+            </w:r>
+            <w:proofErr w:type="spellEnd"/>
+            <w:proofErr w:type="gramEnd"/>
+            <w:r>
+              <w:t xml:space="preserve">, </w:t>
+            </w:r>
+            <w:proofErr w:type="spellStart"/>
+            <w:proofErr w:type="gramStart"/>
+            <w:r>
+              <w:t>A.StatusCode</w:t>
+            </w:r>
+            <w:proofErr w:type="spellEnd"/>
+            <w:proofErr w:type="gramEnd"/>
+            <w:r>
+              <w:t xml:space="preserve">  </w:t>
+            </w:r>
+            <w:proofErr w:type="gramStart"/>
+            <w:r>
+              <w:t>FROM  </w:t>
+            </w:r>
+            <w:proofErr w:type="spellStart"/>
+            <w:r>
+              <w:t>HMC</w:t>
+            </w:r>
+            <w:proofErr w:type="gramEnd"/>
+            <w:r>
+              <w:t>_Sanad_AppMaster_VW</w:t>
+            </w:r>
+            <w:proofErr w:type="spellEnd"/>
+            <w:r>
+              <w:t xml:space="preserve"> A WHERE </w:t>
+            </w:r>
+            <w:proofErr w:type="spellStart"/>
+            <w:proofErr w:type="gramStart"/>
+            <w:r>
+              <w:t>A.AppID</w:t>
+            </w:r>
+            <w:proofErr w:type="spellEnd"/>
+            <w:proofErr w:type="gramEnd"/>
+            <w:r>
+              <w:t xml:space="preserve"> = 1</w:t>
             </w:r>
           </w:p>
         </w:tc>
@@ -508,9 +1432,12 @@
             <w:hideMark/>
           </w:tcPr>
           <w:p>
-            <w:r>
+            <w:proofErr w:type="spellStart"/>
+            <w:r>
+              <w:lastRenderedPageBreak/>
               <w:t>forgetMPIN</w:t>
             </w:r>
+            <w:proofErr w:type="spellEnd"/>
           </w:p>
         </w:tc>
         <w:tc>
@@ -533,7 +1460,15 @@
           </w:tcPr>
           <w:p>
             <w:r>
-              <w:t>/auth/mpin/update/initiate</w:t>
+              <w:t>/auth/</w:t>
+            </w:r>
+            <w:proofErr w:type="spellStart"/>
+            <w:r>
+              <w:t>mpin</w:t>
+            </w:r>
+            <w:proofErr w:type="spellEnd"/>
+            <w:r>
+              <w:t>/update/initiate</w:t>
             </w:r>
           </w:p>
           <w:p>
@@ -543,7 +1478,71 @@
           </w:p>
           <w:p>
             <w:r>
-              <w:t>SELECT DeviceID FROM  HMC_Sanad_DeviceRegn_tbl  WHERE IMEINumber = &lt;EmployeeDeviceIMEINumber&gt; AND LoginID = &lt;EmployeeUserName&gt;</w:t>
+              <w:t xml:space="preserve">SELECT </w:t>
+            </w:r>
+            <w:proofErr w:type="spellStart"/>
+            <w:r>
+              <w:t>DeviceID</w:t>
+            </w:r>
+            <w:proofErr w:type="spellEnd"/>
+            <w:r>
+              <w:t xml:space="preserve"> </w:t>
+            </w:r>
+            <w:proofErr w:type="gramStart"/>
+            <w:r>
+              <w:t>FROM  </w:t>
+            </w:r>
+            <w:proofErr w:type="spellStart"/>
+            <w:r>
+              <w:t>HMC</w:t>
+            </w:r>
+            <w:proofErr w:type="gramEnd"/>
+            <w:r>
+              <w:t>_Sanad_DeviceRegn_</w:t>
+            </w:r>
+            <w:proofErr w:type="gramStart"/>
+            <w:r>
+              <w:t>tbl</w:t>
+            </w:r>
+            <w:proofErr w:type="spellEnd"/>
+            <w:r>
+              <w:t xml:space="preserve">  WHERE</w:t>
+            </w:r>
+            <w:proofErr w:type="gramEnd"/>
+            <w:r>
+              <w:t xml:space="preserve"> </w:t>
+            </w:r>
+            <w:proofErr w:type="spellStart"/>
+            <w:r>
+              <w:t>IMEINumber</w:t>
+            </w:r>
+            <w:proofErr w:type="spellEnd"/>
+            <w:r>
+              <w:t xml:space="preserve"> = &lt;</w:t>
+            </w:r>
+            <w:proofErr w:type="spellStart"/>
+            <w:r>
+              <w:t>EmployeeDeviceIMEINumber</w:t>
+            </w:r>
+            <w:proofErr w:type="spellEnd"/>
+            <w:r>
+              <w:t xml:space="preserve">&gt; AND </w:t>
+            </w:r>
+            <w:proofErr w:type="spellStart"/>
+            <w:r>
+              <w:t>LoginID</w:t>
+            </w:r>
+            <w:proofErr w:type="spellEnd"/>
+            <w:r>
+              <w:t xml:space="preserve"> = &lt;</w:t>
+            </w:r>
+            <w:proofErr w:type="spellStart"/>
+            <w:r>
+              <w:t>EmployeeUserName</w:t>
+            </w:r>
+            <w:proofErr w:type="spellEnd"/>
+            <w:r>
+              <w:t>&gt;</w:t>
             </w:r>
           </w:p>
         </w:tc>
@@ -571,10 +1570,11 @@
             <w:hideMark/>
           </w:tcPr>
           <w:p>
-            <w:r>
-              <w:lastRenderedPageBreak/>
+            <w:proofErr w:type="spellStart"/>
+            <w:r>
               <w:t>resetMPIN</w:t>
             </w:r>
+            <w:proofErr w:type="spellEnd"/>
           </w:p>
         </w:tc>
         <w:tc>
@@ -597,7 +1597,15 @@
           </w:tcPr>
           <w:p>
             <w:r>
-              <w:t>/auth/mpin/update/reset</w:t>
+              <w:t>/auth/</w:t>
+            </w:r>
+            <w:proofErr w:type="spellStart"/>
+            <w:r>
+              <w:t>mpin</w:t>
+            </w:r>
+            <w:proofErr w:type="spellEnd"/>
+            <w:r>
+              <w:t>/update/reset</w:t>
             </w:r>
           </w:p>
           <w:p>
@@ -607,7 +1615,63 @@
           </w:p>
           <w:p>
             <w:r>
-              <w:t>UPDATE HMC_Sanad_DeviceRegn_tbl SET DateFirstRegistered = GETDATE(), MPIN = &lt;MPIN&gt; WHERE LoginID = &lt;EmployeeUserName&gt; AND IMEINumber = &lt;EmployeeDeviceIMEINumber&gt;</w:t>
+              <w:t xml:space="preserve">UPDATE </w:t>
+            </w:r>
+            <w:proofErr w:type="spellStart"/>
+            <w:r>
+              <w:t>HMC_Sanad_DeviceRegn_tbl</w:t>
+            </w:r>
+            <w:proofErr w:type="spellEnd"/>
+            <w:r>
+              <w:t xml:space="preserve"> SET </w:t>
+            </w:r>
+            <w:proofErr w:type="spellStart"/>
+            <w:r>
+              <w:t>DateFirstRegistered</w:t>
+            </w:r>
+            <w:proofErr w:type="spellEnd"/>
+            <w:r>
+              <w:t xml:space="preserve"> = </w:t>
+            </w:r>
+            <w:proofErr w:type="gramStart"/>
+            <w:r>
+              <w:t>GETDATE(</w:t>
+            </w:r>
+            <w:proofErr w:type="gramEnd"/>
+            <w:r>
+              <w:t xml:space="preserve">), MPIN = &lt;MPIN&gt; WHERE </w:t>
+            </w:r>
+            <w:proofErr w:type="spellStart"/>
+            <w:r>
+              <w:t>LoginID</w:t>
+            </w:r>
+            <w:proofErr w:type="spellEnd"/>
+            <w:r>
+              <w:t xml:space="preserve"> = &lt;</w:t>
+            </w:r>
+            <w:proofErr w:type="spellStart"/>
+            <w:r>
+              <w:t>EmployeeUserName</w:t>
+            </w:r>
+            <w:proofErr w:type="spellEnd"/>
+            <w:r>
+              <w:t xml:space="preserve">&gt; AND </w:t>
+            </w:r>
+            <w:proofErr w:type="spellStart"/>
+            <w:r>
+              <w:t>IMEINumber</w:t>
+            </w:r>
+            <w:proofErr w:type="spellEnd"/>
+            <w:r>
+              <w:t xml:space="preserve"> = &lt;</w:t>
+            </w:r>
+            <w:proofErr w:type="spellStart"/>
+            <w:r>
+              <w:t>EmployeeDeviceIMEINumber</w:t>
+            </w:r>
+            <w:proofErr w:type="spellEnd"/>
+            <w:r>
+              <w:t>&gt;</w:t>
             </w:r>
           </w:p>
         </w:tc>
@@ -669,9 +1733,11 @@
             <w:hideMark/>
           </w:tcPr>
           <w:p>
+            <w:proofErr w:type="spellStart"/>
             <w:r>
               <w:t>Validateoracleuser</w:t>
             </w:r>
+            <w:proofErr w:type="spellEnd"/>
           </w:p>
         </w:tc>
         <w:tc>
@@ -694,8 +1760,29 @@
           </w:tcPr>
           <w:p>
             <w:r>
-              <w:t>/employee/profile/validatehruser?enum=$enum&amp;lang=en</w:t>
-            </w:r>
+              <w:t>/employee/profile/</w:t>
+            </w:r>
+            <w:proofErr w:type="spellStart"/>
+            <w:r>
+              <w:t>validatehruser?enum</w:t>
+            </w:r>
+            <w:proofErr w:type="spellEnd"/>
+            <w:r>
+              <w:t>=$</w:t>
+            </w:r>
+            <w:proofErr w:type="spellStart"/>
+            <w:r>
+              <w:t>enum&amp;lang</w:t>
+            </w:r>
+            <w:proofErr w:type="spellEnd"/>
+            <w:r>
+              <w:t>=</w:t>
+            </w:r>
+            <w:proofErr w:type="spellStart"/>
+            <w:r>
+              <w:t>en</w:t>
+            </w:r>
+            <w:proofErr w:type="spellEnd"/>
           </w:p>
           <w:p>
             <w:r>

</xml_diff>